<commit_message>
Phase 6.5 — Database and Migration Startup
</commit_message>
<xml_diff>
--- a/docs/METHODOLOGY.docx
+++ b/docs/METHODOLOGY.docx
@@ -6718,6 +6718,124 @@
         <w:t xml:space="preserve">email could be promoted to ADMIN by seeding).</w:t>
       </w:r>
     </w:p>
+    <w:p>
+      <w:pPr>
+        <w:pStyle w:val="Compact"/>
+        <w:numPr>
+          <w:ilvl w:val="0"/>
+          <w:numId w:val="1016"/>
+        </w:numPr>
+      </w:pPr>
+      <w:r>
+        <w:rPr>
+          <w:b/>
+          <w:bCs/>
+        </w:rPr>
+        <w:t xml:space="preserve">Schema drift undetected at startup</w:t>
+      </w:r>
+      <w:r>
+        <w:t xml:space="preserve"> </w:t>
+      </w:r>
+      <w:r>
+        <w:t xml:space="preserve">—</w:t>
+      </w:r>
+      <w:r>
+        <w:t xml:space="preserve"> </w:t>
+      </w:r>
+      <w:r>
+        <w:rPr>
+          <w:i/>
+          <w:iCs/>
+        </w:rPr>
+        <w:t xml:space="preserve">Resolved (Phase 6.5).</w:t>
+      </w:r>
+      <w:r>
+        <w:t xml:space="preserve"> </w:t>
+      </w:r>
+      <w:r>
+        <w:t xml:space="preserve">The backend’s health check never touched the database, and nothing compared the database’s migration revision with the code, so an unmigrated or mismatched schema was served until the first query hit a missing table.</w:t>
+      </w:r>
+      <w:r>
+        <w:t xml:space="preserve"> </w:t>
+      </w:r>
+      <w:r>
+        <w:rPr>
+          <w:rStyle w:val="VerbatimChar"/>
+        </w:rPr>
+        <w:t xml:space="preserve">GET /api/health/ready</w:t>
+      </w:r>
+      <w:r>
+        <w:t xml:space="preserve"> </w:t>
+      </w:r>
+      <w:r>
+        <w:t xml:space="preserve">now reports readiness against the build’s Alembic head, the Compose healthcheck uses it, and a production backend refuses to start unless the schema is current. Concurrent migration runs are serialized by an advisory lock. The chain is verified from an empty database, including a full downgrade and upgrade round trip and structural parity with the ORM models.</w:t>
+      </w:r>
+    </w:p>
+    <w:p>
+      <w:pPr>
+        <w:pStyle w:val="Compact"/>
+        <w:numPr>
+          <w:ilvl w:val="0"/>
+          <w:numId w:val="1016"/>
+        </w:numPr>
+      </w:pPr>
+      <w:r>
+        <w:rPr>
+          <w:b/>
+          <w:bCs/>
+        </w:rPr>
+        <w:t xml:space="preserve">Defects visible only against live PostgreSQL</w:t>
+      </w:r>
+      <w:r>
+        <w:t xml:space="preserve"> </w:t>
+      </w:r>
+      <w:r>
+        <w:t xml:space="preserve">—</w:t>
+      </w:r>
+      <w:r>
+        <w:t xml:space="preserve"> </w:t>
+      </w:r>
+      <w:r>
+        <w:rPr>
+          <w:i/>
+          <w:iCs/>
+        </w:rPr>
+        <w:t xml:space="preserve">Resolved.</w:t>
+      </w:r>
+      <w:r>
+        <w:t xml:space="preserve"> </w:t>
+      </w:r>
+      <w:r>
+        <w:t xml:space="preserve">A walkthrough of every feature on a seeded PostgreSQL stack found failures that the SQLite-based suite and signature-agnostic route mocks had hidden. pgvector embeddings arrive as numpy</w:t>
+      </w:r>
+      <w:r>
+        <w:t xml:space="preserve"> </w:t>
+      </w:r>
+      <w:r>
+        <w:rPr>
+          <w:rStyle w:val="VerbatimChar"/>
+        </w:rPr>
+        <w:t xml:space="preserve">float32</w:t>
+      </w:r>
+      <w:r>
+        <w:t xml:space="preserve"> </w:t>
+      </w:r>
+      <w:r>
+        <w:t xml:space="preserve">and were rejected by the query-vector validator. One service call carried an unsupported argument. A first-load governance race caused a unique violation. A signed adaptive adjustment was written into a 0–1 score. The frontend also had four gaps: a response-shape mismatch, a linked page that did not exist, a Save button that never reached the workspace, and an unreachable page. Two styling gaps were fixed as well. Each behavioural fix has regression tests, and the new route regression tests use</w:t>
+      </w:r>
+      <w:r>
+        <w:t xml:space="preserve"> </w:t>
+      </w:r>
+      <w:r>
+        <w:rPr>
+          <w:rStyle w:val="VerbatimChar"/>
+        </w:rPr>
+        <w:t xml:space="preserve">autospec</w:t>
+      </w:r>
+      <w:r>
+        <w:t xml:space="preserve">, so a signature mismatch fails.</w:t>
+      </w:r>
+    </w:p>
     <w:bookmarkEnd w:id="38"/>
     <w:bookmarkStart w:id="39" w:name="known-remaining-limitations"/>
     <w:p>
@@ -6920,6 +7038,25 @@
       </w:r>
       <w:r>
         <w:t xml:space="preserve">) can fail under CPU contention while passing on a quiet machine or when rerun alone.</w:t>
+      </w:r>
+    </w:p>
+    <w:p>
+      <w:pPr>
+        <w:pStyle w:val="Compact"/>
+        <w:numPr>
+          <w:ilvl w:val="0"/>
+          <w:numId w:val="1017"/>
+        </w:numPr>
+      </w:pPr>
+      <w:r>
+        <w:rPr>
+          <w:b/>
+          <w:bCs/>
+        </w:rPr>
+        <w:t xml:space="preserve">Model-declared indexes absent from the schema</w:t>
+      </w:r>
+      <w:r>
+        <w:t xml:space="preserve">: the ORM models declare 37 plain single-column indexes (mostly on low-cardinality status, priority and dimension columns) that no migration creates. Queries are correct without them; whether any justify their write cost is left to the Phase 6.8/6.9 performance audit rather than added speculatively.</w:t>
       </w:r>
     </w:p>
     <w:p>
@@ -7001,7 +7138,7 @@
               <w:pStyle w:val="Compact"/>
             </w:pPr>
             <w:r>
-              <w:t xml:space="preserve">Next.js 15.5 (App Router), React 19.2, TypeScript 5.9, Vanilla CSS Tokens</w:t>
+              <w:t xml:space="preserve">Next.js 15.5 (App Router), React 19.2, TypeScript 5.9, CSS design tokens + Tailwind CSS 3 utilities (no preflight)</w:t>
             </w:r>
           </w:p>
         </w:tc>
@@ -7452,7 +7589,7 @@
               <w:pStyle w:val="Compact"/>
             </w:pPr>
             <w:r>
-              <w:t xml:space="preserve">98 pytest modules (1,538 tests) enforcing unit correctness, security, and mathematical invariants, plus 9 Vitest files (158 tests) for the frontend</w:t>
+              <w:t xml:space="preserve">101 pytest modules (1,582 tests) enforcing unit correctness, security, and mathematical invariants, plus 13 Vitest files (169 tests) for the frontend</w:t>
             </w:r>
           </w:p>
         </w:tc>

</xml_diff>

<commit_message>
Phase 6.6 — END-TO-END VERIFICATION
</commit_message>
<xml_diff>
--- a/docs/METHODOLOGY.docx
+++ b/docs/METHODOLOGY.docx
@@ -6836,6 +6836,71 @@
         <w:t xml:space="preserve">, so a signature mismatch fails.</w:t>
       </w:r>
     </w:p>
+    <w:p>
+      <w:pPr>
+        <w:pStyle w:val="Compact"/>
+        <w:numPr>
+          <w:ilvl w:val="0"/>
+          <w:numId w:val="1016"/>
+        </w:numPr>
+      </w:pPr>
+      <w:r>
+        <w:rPr>
+          <w:b/>
+          <w:bCs/>
+        </w:rPr>
+        <w:t xml:space="preserve">No verification of the running system as a whole</w:t>
+      </w:r>
+      <w:r>
+        <w:t xml:space="preserve"> </w:t>
+      </w:r>
+      <w:r>
+        <w:t xml:space="preserve">—</w:t>
+      </w:r>
+      <w:r>
+        <w:t xml:space="preserve"> </w:t>
+      </w:r>
+      <w:r>
+        <w:rPr>
+          <w:i/>
+          <w:iCs/>
+        </w:rPr>
+        <w:t xml:space="preserve">Resolved (Phase 6.6).</w:t>
+      </w:r>
+      <w:r>
+        <w:t xml:space="preserve"> </w:t>
+      </w:r>
+      <w:r>
+        <w:t xml:space="preserve">Every earlier test ran one layer in-process.</w:t>
+      </w:r>
+      <w:r>
+        <w:t xml:space="preserve"> </w:t>
+      </w:r>
+      <w:r>
+        <w:rPr>
+          <w:rStyle w:val="VerbatimChar"/>
+        </w:rPr>
+        <w:t xml:space="preserve">e2e/run_e2e.py</w:t>
+      </w:r>
+      <w:r>
+        <w:t xml:space="preserve"> </w:t>
+      </w:r>
+      <w:r>
+        <w:t xml:space="preserve">now starts the production Compose stack in isolation from an empty database and verifies it across service boundaries: real bearer-token HTTP, SQL checks of stored state, a Playwright browser suite that fails on any API error the UI triggers, the scheduler running in the backend, and restarts. It found and fixed one defect: re-saving a workspace item reset its stage and priority. See</w:t>
+      </w:r>
+      <w:r>
+        <w:t xml:space="preserve"> </w:t>
+      </w:r>
+      <w:r>
+        <w:rPr>
+          <w:rStyle w:val="VerbatimChar"/>
+        </w:rPr>
+        <w:t xml:space="preserve">PHASE_6_6_E2E_VERIFICATION_REPORT.md</w:t>
+      </w:r>
+      <w:r>
+        <w:t xml:space="preserve">.</w:t>
+      </w:r>
+    </w:p>
     <w:bookmarkEnd w:id="38"/>
     <w:bookmarkStart w:id="39" w:name="known-remaining-limitations"/>
     <w:p>
@@ -7057,6 +7122,59 @@
       </w:r>
       <w:r>
         <w:t xml:space="preserve">: the ORM models declare 37 plain single-column indexes (mostly on low-cardinality status, priority and dimension columns) that no migration creates. Queries are correct without them; whether any justify their write cost is left to the Phase 6.8/6.9 performance audit rather than added speculatively.</w:t>
+      </w:r>
+    </w:p>
+    <w:p>
+      <w:pPr>
+        <w:pStyle w:val="Compact"/>
+        <w:numPr>
+          <w:ilvl w:val="0"/>
+          <w:numId w:val="1017"/>
+        </w:numPr>
+      </w:pPr>
+      <w:r>
+        <w:rPr>
+          <w:b/>
+          <w:bCs/>
+        </w:rPr>
+        <w:t xml:space="preserve">Sessions end in the browser only</w:t>
+      </w:r>
+      <w:r>
+        <w:t xml:space="preserve">: signing out discards the token client-side; an issued JWT stays valid until it expires (480 minutes by default). Deactivating an account does revoke it immediately. Assessed in Phase 6.7.</w:t>
+      </w:r>
+    </w:p>
+    <w:p>
+      <w:pPr>
+        <w:pStyle w:val="Compact"/>
+        <w:numPr>
+          <w:ilvl w:val="0"/>
+          <w:numId w:val="1017"/>
+        </w:numPr>
+      </w:pPr>
+      <w:r>
+        <w:rPr>
+          <w:b/>
+          <w:bCs/>
+        </w:rPr>
+        <w:t xml:space="preserve">Embedding model fetched at first query</w:t>
+      </w:r>
+      <w:r>
+        <w:t xml:space="preserve">: the backend image downloads</w:t>
+      </w:r>
+      <w:r>
+        <w:t xml:space="preserve"> </w:t>
+      </w:r>
+      <w:r>
+        <w:rPr>
+          <w:rStyle w:val="VerbatimChar"/>
+        </w:rPr>
+        <w:t xml:space="preserve">all-MiniLM-L6-v2</w:t>
+      </w:r>
+      <w:r>
+        <w:t xml:space="preserve"> </w:t>
+      </w:r>
+      <w:r>
+        <w:t xml:space="preserve">on the first literature search after a container starts (measured 30.4 s) and needs outbound network to do so. Semantic search falls back to lexical ranking if the download fails. Addressed in Phase 6.8/6.9.</w:t>
       </w:r>
     </w:p>
     <w:p>
@@ -7589,7 +7707,7 @@
               <w:pStyle w:val="Compact"/>
             </w:pPr>
             <w:r>
-              <w:t xml:space="preserve">101 pytest modules (1,582 tests) enforcing unit correctness, security, and mathematical invariants, plus 13 Vitest files (169 tests) for the frontend</w:t>
+              <w:t xml:space="preserve">101 pytest modules (1,583 tests) enforcing unit correctness, security, and mathematical invariants, 13 Vitest files (169 tests) for the frontend, and an end-to-end suite (79 tests: API, Playwright browser and stack) run against the deployed Compose stack</w:t>
             </w:r>
           </w:p>
         </w:tc>

</xml_diff>